<commit_message>
Split placement from production in the invoice, and name the scroller outdoor
The fee base only holds up if the two services are priced separately, so the
offer now requires it: clause 7.3 makes placement and production separate
services shown on separate lines of the счёт-протокол, the invoice and the act,
and clause 8.6 points at it. The site's own breakdown follows the same wording
— "Размещение рекламы" and "Изготовление постера" instead of rent and printing.

Clause 8.4 now states outright that scrollers, media scrollers and LED screens
are outdoor advertising, rather than leaving the media scroller to inference.

Co-Authored-By: Claude Opus 5 <noreply@anthropic.com>
</commit_message>
<xml_diff>
--- a/Публичная_оферта_forus_by.docx
+++ b/Публичная_оферта_forus_by.docx
@@ -151,7 +151,7 @@
         <w:t xml:space="preserve">Счёт-протокол</w:t>
       </w:r>
       <w:r>
-        <w:t xml:space="preserve"> — документ, подписываемый сторонами и содержащий перечень позиций, период размещения, стоимость услуг и порядок оплаты. Счёт-протокол является неотъемлемой частью заключённого договора.</w:t>
+        <w:t xml:space="preserve"> — документ, подписываемый сторонами и содержащий перечень позиций, период размещения, стоимость услуг и порядок оплаты. Стоимость услуг по размещению (распространению) рекламы и стоимость работ по изготовлению рекламных материалов указываются в счёте-протоколе отдельными строками. Счёт-протокол является неотъемлемой частью заключённого договора.</w:t>
       </w:r>
     </w:p>
     <w:p>
@@ -967,7 +967,7 @@
     </w:p>
     <w:p>
       <w:r>
-        <w:t xml:space="preserve">7.3. Изготовление (печать) плакатов, а также дополнительные замены рекламных материалов оплачиваются Заказчиком отдельно по действующему прейскуранту.</w:t>
+        <w:t xml:space="preserve">7.3. Размещение (распространение) рекламы и изготовление (печать) рекламных материалов являются самостоятельными услугами. Их стоимость определяется отдельно и указывается отдельными строками в счёте-протоколе, счёте на оплату и акте оказанных услуг. Дополнительные замены рекламных материалов оплачиваются отдельно по действующему прейскуранту.</w:t>
       </w:r>
     </w:p>
     <w:p>
@@ -1010,7 +1010,7 @@
     </w:p>
     <w:p>
       <w:r>
-        <w:t xml:space="preserve">8.4. При размещении наружной рекламы — на скроллерах, медиа-скроллерах и светодиодных экранах — сбор исчисляется по ставке 10 процентов.</w:t>
+        <w:t xml:space="preserve">8.4. Размещение рекламы на скроллерах, медиа-скроллерах и светодиодных экранах является размещением наружной рекламы: сбор по нему исчисляется по ставке 10 процентов.</w:t>
       </w:r>
     </w:p>
     <w:p>
@@ -1020,7 +1020,7 @@
     </w:p>
     <w:p>
       <w:r>
-        <w:t xml:space="preserve">8.6. Базой для исчисления сбора является указанная в договоре стоимость фактически оказанных Заказчику услуг по размещению (распространению) рекламы без налога на добавленную стоимость. Стоимость изготовления и печати рекламных материалов в базу не включается.</w:t>
+        <w:t xml:space="preserve">8.6. Базой для исчисления сбора является указанная в договоре стоимость фактически оказанных Заказчику услуг по размещению (распространению) рекламы без налога на добавленную стоимость. Стоимость изготовления (печати) рекламных материалов в базу не включается и указывается отдельно в порядке, предусмотренном пунктом 7.3 настоящей оферты.</w:t>
       </w:r>
     </w:p>
     <w:p>

</xml_diff>

<commit_message>
Make the poster an option the client can switch off per placement
A client who already has a suitable banner should not pay to have one printed,
and until now the 105 BYN was welded into every scroller line. Each media-plan
row now carries the choice — "Изготовим плакат" or "Плакат свой" — and so does
the price card on the placement page; the summary counts both kinds separately.

With the choice comes the rule that governs it, in the offer as clauses
6.9–6.12: our poster is guaranteed for three months and replaced at our cost if
it tears in that time, after which replacement is the client's; a poster the
client supplies carries no guarantee from us. The same wording is served from
RL.printInfo to the media plan, the placement card and the info page, so the
three cannot drift apart.

Old saved plans have no print field; a missing value reads as "print it", which
keeps their totals unchanged.

Co-Authored-By: Claude Opus 5 <noreply@anthropic.com>
</commit_message>
<xml_diff>
--- a/Публичная_оферта_forus_by.docx
+++ b/Публичная_оферта_forus_by.docx
@@ -945,6 +945,43 @@
     <w:p>
       <w:r>
         <w:t xml:space="preserve">6.8. Материалы, содержащие рекламу, и копии истребованных документов хранятся Исполнителем в течение шести месяцев со дня последнего размещения (распространения) рекламы в соответствии со статьёй 29 Закона о рекламе.</w:t>
+      </w:r>
+    </w:p>
+    <w:p>
+      <w:pPr>
+        <w:pStyle w:val="Heading3"/>
+      </w:pPr>
+      <w:r>
+        <w:t xml:space="preserve">Плакат для скроллера</w:t>
+      </w:r>
+    </w:p>
+    <w:p>
+      <w:r>
+        <w:t xml:space="preserve">6.9. Плакат для размещения на скроллере изготавливает Исполнитель, если стороны не согласовали иное. Заказчик вправе предоставить собственный плакат, соответствующий техническим требованиям, опубликованным на Портале, и размеру рекламной поверхности. В этом случае услуга по изготовлению плаката не оказывается и не оплачивается, а выбор фиксируется в счёте-протоколе по каждой позиции отдельно.</w:t>
+      </w:r>
+    </w:p>
+    <w:p>
+      <w:r>
+        <w:t xml:space="preserve">6.10. На плакат, изготовленный Исполнителем, устанавливается гарантийный срок </w:t>
+      </w:r>
+      <w:r>
+        <w:rPr>
+          <w:b/>
+        </w:rPr>
+        <w:t xml:space="preserve">три месяца</w:t>
+      </w:r>
+      <w:r>
+        <w:t xml:space="preserve"> с даты монтажа. Если в течение гарантийного срока плакат порвётся или утратит вид, Исполнитель изготавливает и монтирует новый плакат за свой счёт.</w:t>
+      </w:r>
+    </w:p>
+    <w:p>
+      <w:r>
+        <w:t xml:space="preserve">6.11. По истечении гарантийного срока замена плаката производится по действующему прейскуранту за счёт Заказчика.</w:t>
+      </w:r>
+    </w:p>
+    <w:p>
+      <w:r>
+        <w:t xml:space="preserve">6.12. На плакат, предоставленный Заказчиком, гарантийный срок не устанавливается. Замена такого плаката, в том числе при его повреждении, производится за счёт Заказчика.</w:t>
       </w:r>
     </w:p>
     <w:p>

</xml_diff>

<commit_message>
Exclude vandalism from the poster guarantee
A torn poster on a street stop is usually somebody's hand, not the material
failing, so an unconditional three-month guarantee would have the company
reprinting after every act of vandalism at its own cost. Clause 6.11 now
carves out damage by third parties, road accidents and force majeure.

Against that, 6.12 obliges the company to notice: it tells the client about
the damage by the next working day, names the likely cause and agrees the
replacement — so the exclusion cannot become a reason to leave a torn poster
hanging.

Co-Authored-By: Claude Opus 5 <noreply@anthropic.com>
</commit_message>
<xml_diff>
--- a/Публичная_оферта_forus_by.docx
+++ b/Публичная_оферта_forus_by.docx
@@ -976,12 +976,22 @@
     </w:p>
     <w:p>
       <w:r>
-        <w:t xml:space="preserve">6.11. По истечении гарантийного срока замена плаката производится по действующему прейскуранту за счёт Заказчика.</w:t>
-      </w:r>
-    </w:p>
-    <w:p>
-      <w:r>
-        <w:t xml:space="preserve">6.12. На плакат, предоставленный Заказчиком, гарантийный срок не устанавливается. Замена такого плаката, в том числе при его повреждении, производится за счёт Заказчика.</w:t>
+        <w:t xml:space="preserve">6.11. Гарантия не распространяется на повреждения, причинённые действиями третьих лиц (вандализм, порча, хищение, нанесение надписей и наклеек), дорожно-транспортным происшествием, а также возникшие вследствие обстоятельств непреодолимой силы. Замена плаката в этих случаях производится за счёт Заказчика по действующему прейскуранту.</w:t>
+      </w:r>
+    </w:p>
+    <w:p>
+      <w:r>
+        <w:t xml:space="preserve">6.12. Об обнаруженном повреждении плаката Исполнитель уведомляет Заказчика не позднее следующего рабочего дня, сообщает предполагаемую причину повреждения и согласует замену.</w:t>
+      </w:r>
+    </w:p>
+    <w:p>
+      <w:r>
+        <w:t xml:space="preserve">6.13. По истечении гарантийного срока замена плаката производится по действующему прейскуранту за счёт Заказчика.</w:t>
+      </w:r>
+    </w:p>
+    <w:p>
+      <w:r>
+        <w:t xml:space="preserve">6.14. На плакат, предоставленный Заказчиком, гарантийный срок не устанавливается. Замена такого плаката, в том числе при его повреждении, производится за счёт Заказчика.</w:t>
       </w:r>
     </w:p>
     <w:p>

</xml_diff>